<commit_message>
resume updated to include kitchen agent project
</commit_message>
<xml_diff>
--- a/SaumiRahnamay - Resume.docx
+++ b/SaumiRahnamay - Resume.docx
@@ -254,7 +254,7 @@
           <w:sz w:val="20"/>
           <w:szCs w:val="20"/>
         </w:rPr>
-        <w:t>Public Speaking</w:t>
+        <w:t>Critical Thinking</w:t>
       </w:r>
     </w:p>
     <w:p>
@@ -280,7 +280,7 @@
           <w:sz w:val="20"/>
           <w:szCs w:val="20"/>
         </w:rPr>
-        <w:t>Statistical Modeling</w:t>
+        <w:t>Agentic AI</w:t>
       </w:r>
     </w:p>
     <w:p>
@@ -384,7 +384,7 @@
           <w:sz w:val="20"/>
           <w:szCs w:val="20"/>
         </w:rPr>
-        <w:t>Communication and Collaboration</w:t>
+        <w:t>Leadership and Collaboration</w:t>
       </w:r>
     </w:p>
     <w:p>
@@ -773,7 +773,7 @@
           <w:sz w:val="20"/>
           <w:szCs w:val="20"/>
         </w:rPr>
-        <w:t>Google Fiber BI Dashboard</w:t>
+        <w:t>BPE Tokenizer From Scratch</w:t>
         <w:tab/>
       </w:r>
       <w:hyperlink r:id="rId8">
@@ -783,10 +783,11 @@
             <w:rFonts w:ascii="Ubuntu Sans" w:hAnsi="Ubuntu Sans"/>
             <w:b w:val="false"/>
             <w:bCs w:val="false"/>
+            <w:color w:val="3465A4"/>
             <w:sz w:val="20"/>
             <w:szCs w:val="20"/>
           </w:rPr>
-          <w:t>Available on Tableau</w:t>
+          <w:t>Available on Website</w:t>
         </w:r>
       </w:hyperlink>
     </w:p>
@@ -816,7 +817,57 @@
           <w:sz w:val="20"/>
           <w:szCs w:val="20"/>
         </w:rPr>
-        <w:t xml:space="preserve">A dashboard and executive documents for a fictional internet company. Monitors customer service repeat caller volume to make recommendations to stakeholders. </w:t>
+        <w:t xml:space="preserve">A </w:t>
+      </w:r>
+      <w:r>
+        <w:rPr>
+          <w:rFonts w:ascii="Ubuntu Sans" w:hAnsi="Ubuntu Sans"/>
+          <w:i w:val="false"/>
+          <w:iCs w:val="false"/>
+          <w:sz w:val="20"/>
+          <w:szCs w:val="20"/>
+        </w:rPr>
+        <w:t xml:space="preserve">Byte-Pair Encoding Tokenizer </w:t>
+      </w:r>
+      <w:r>
+        <w:rPr>
+          <w:rFonts w:ascii="Ubuntu Sans" w:hAnsi="Ubuntu Sans"/>
+          <w:i w:val="false"/>
+          <w:iCs w:val="false"/>
+          <w:sz w:val="20"/>
+          <w:szCs w:val="20"/>
+        </w:rPr>
+        <w:t xml:space="preserve">coded </w:t>
+      </w:r>
+      <w:r>
+        <w:rPr>
+          <w:rFonts w:ascii="Ubuntu Sans" w:hAnsi="Ubuntu Sans"/>
+          <w:i w:val="false"/>
+          <w:iCs w:val="false"/>
+          <w:sz w:val="20"/>
+          <w:szCs w:val="20"/>
+        </w:rPr>
+        <w:t xml:space="preserve">from scratch </w:t>
+      </w:r>
+      <w:r>
+        <w:rPr>
+          <w:rFonts w:ascii="Ubuntu Sans" w:hAnsi="Ubuntu Sans"/>
+          <w:i w:val="false"/>
+          <w:iCs w:val="false"/>
+          <w:sz w:val="20"/>
+          <w:szCs w:val="20"/>
+        </w:rPr>
+        <w:t>with no AI assistance</w:t>
+      </w:r>
+      <w:r>
+        <w:rPr>
+          <w:rFonts w:ascii="Ubuntu Sans" w:hAnsi="Ubuntu Sans"/>
+          <w:i w:val="false"/>
+          <w:iCs w:val="false"/>
+          <w:sz w:val="20"/>
+          <w:szCs w:val="20"/>
+        </w:rPr>
+        <w:t>. Tokenization is the first step of any machine learning application involving natural language (e.g. LLMs).</w:t>
       </w:r>
     </w:p>
     <w:p>
@@ -845,7 +896,7 @@
           <w:sz w:val="20"/>
           <w:szCs w:val="20"/>
         </w:rPr>
-        <w:t>Data pipelining performed with BigQuery, and visualizations in Tableau.</w:t>
+        <w:t>Packages: NumPy</w:t>
       </w:r>
     </w:p>
     <w:p>
@@ -963,7 +1014,7 @@
           <w:sz w:val="20"/>
           <w:szCs w:val="20"/>
         </w:rPr>
-        <w:t>BC Housing: Endemic</w:t>
+        <w:t xml:space="preserve">Agent: Kitchen Assistant </w:t>
       </w:r>
       <w:r>
         <w:rPr>
@@ -1007,62 +1058,17 @@
           <w:sz w:val="20"/>
           <w:szCs w:val="20"/>
         </w:rPr>
-        <w:t xml:space="preserve">Social Data Analytics Capstone, presented at </w:t>
-      </w:r>
-      <w:r>
-        <w:fldChar w:fldCharType="begin"/>
-      </w:r>
-      <w:r>
-        <w:rPr>
-          <w:rStyle w:val="Hyperlink"/>
-          <w:sz w:val="20"/>
-          <w:i w:val="false"/>
-          <w:b/>
-          <w:szCs w:val="20"/>
-          <w:iCs w:val="false"/>
-          <w:bCs/>
-          <w:rFonts w:ascii="Ubuntu Sans" w:hAnsi="Ubuntu Sans"/>
-        </w:rPr>
-        <w:instrText xml:space="preserve"> HYPERLINK "https://citystudiovancouver.com/projects/bc-housing-endemic/" \l ":~:text=An%20inquiry%20into%20BC%20Housing,vulnerabilities%20accentuated%20by%20the%20pandemic."</w:instrText>
-      </w:r>
-      <w:r>
-        <w:rPr>
-          <w:rStyle w:val="Hyperlink"/>
-          <w:sz w:val="20"/>
-          <w:i w:val="false"/>
-          <w:b/>
-          <w:szCs w:val="20"/>
-          <w:iCs w:val="false"/>
-          <w:bCs/>
-          <w:rFonts w:ascii="Ubuntu Sans" w:hAnsi="Ubuntu Sans"/>
-        </w:rPr>
-        <w:fldChar w:fldCharType="separate"/>
-      </w:r>
-      <w:r>
-        <w:rPr>
-          <w:rStyle w:val="Hyperlink"/>
-          <w:rFonts w:ascii="Ubuntu Sans" w:hAnsi="Ubuntu Sans"/>
-          <w:b/>
-          <w:bCs/>
+        <w:t>Simple</w:t>
+      </w:r>
+      <w:r>
+        <w:rPr>
+          <w:rFonts w:ascii="Ubuntu Sans" w:hAnsi="Ubuntu Sans"/>
           <w:i w:val="false"/>
           <w:iCs w:val="false"/>
           <w:sz w:val="20"/>
           <w:szCs w:val="20"/>
         </w:rPr>
-        <w:t>HUBBUB 18</w:t>
-      </w:r>
-      <w:r>
-        <w:rPr>
-          <w:rStyle w:val="Hyperlink"/>
-          <w:sz w:val="20"/>
-          <w:i w:val="false"/>
-          <w:b/>
-          <w:szCs w:val="20"/>
-          <w:iCs w:val="false"/>
-          <w:bCs/>
-          <w:rFonts w:ascii="Ubuntu Sans" w:hAnsi="Ubuntu Sans"/>
-        </w:rPr>
-        <w:fldChar w:fldCharType="end"/>
+        <w:t xml:space="preserve"> kitchen </w:t>
       </w:r>
       <w:r>
         <w:rPr>
@@ -1072,7 +1078,57 @@
           <w:sz w:val="20"/>
           <w:szCs w:val="20"/>
         </w:rPr>
-        <w:t>. An inquiry and description of the BC Housing and Rental markets since the onset of the COVID-19 pandemic.</w:t>
+        <w:t>assistant agent</w:t>
+      </w:r>
+      <w:r>
+        <w:rPr>
+          <w:rFonts w:ascii="Ubuntu Sans" w:hAnsi="Ubuntu Sans"/>
+          <w:i w:val="false"/>
+          <w:iCs w:val="false"/>
+          <w:sz w:val="20"/>
+          <w:szCs w:val="20"/>
+        </w:rPr>
+        <w:t xml:space="preserve"> </w:t>
+      </w:r>
+      <w:r>
+        <w:rPr>
+          <w:rFonts w:ascii="Ubuntu Sans" w:hAnsi="Ubuntu Sans"/>
+          <w:i w:val="false"/>
+          <w:iCs w:val="false"/>
+          <w:sz w:val="20"/>
+          <w:szCs w:val="20"/>
+        </w:rPr>
+        <w:t xml:space="preserve">prototype </w:t>
+      </w:r>
+      <w:r>
+        <w:rPr>
+          <w:rFonts w:ascii="Ubuntu Sans" w:hAnsi="Ubuntu Sans"/>
+          <w:i w:val="false"/>
+          <w:iCs w:val="false"/>
+          <w:sz w:val="20"/>
+          <w:szCs w:val="20"/>
+        </w:rPr>
+        <w:t xml:space="preserve">made from scratch. </w:t>
+      </w:r>
+      <w:r>
+        <w:rPr>
+          <w:rFonts w:ascii="Ubuntu Sans" w:hAnsi="Ubuntu Sans"/>
+          <w:i w:val="false"/>
+          <w:iCs w:val="false"/>
+          <w:sz w:val="20"/>
+          <w:szCs w:val="20"/>
+        </w:rPr>
+        <w:t xml:space="preserve">A friendly agent </w:t>
+      </w:r>
+      <w:r>
+        <w:rPr>
+          <w:rFonts w:ascii="Ubuntu Sans" w:hAnsi="Ubuntu Sans"/>
+          <w:i w:val="false"/>
+          <w:iCs w:val="false"/>
+          <w:sz w:val="20"/>
+          <w:szCs w:val="20"/>
+        </w:rPr>
+        <w:t>that provides information about cookbook recipes; ability to scale recipes based on user intent.</w:t>
       </w:r>
     </w:p>
     <w:p>
@@ -1087,11 +1143,7 @@
           <w:tab w:val="right" w:pos="9360" w:leader="none"/>
         </w:tabs>
         <w:spacing w:lineRule="auto" w:line="240" w:before="0" w:after="0"/>
-        <w:rPr>
-          <w:rFonts w:ascii="Ubuntu Sans" w:hAnsi="Ubuntu Sans"/>
-          <w:sz w:val="20"/>
-          <w:szCs w:val="20"/>
-        </w:rPr>
+        <w:rPr/>
       </w:pPr>
       <w:r>
         <w:rPr>
@@ -1101,7 +1153,47 @@
           <w:sz w:val="20"/>
           <w:szCs w:val="20"/>
         </w:rPr>
-        <w:t>Visualizations created with R.</w:t>
+        <w:t xml:space="preserve">Tool calls: </w:t>
+      </w:r>
+      <w:r>
+        <w:rPr>
+          <w:rFonts w:ascii="Ubuntu Sans" w:hAnsi="Ubuntu Sans"/>
+          <w:i w:val="false"/>
+          <w:iCs w:val="false"/>
+          <w:sz w:val="20"/>
+          <w:szCs w:val="20"/>
+        </w:rPr>
+        <w:t xml:space="preserve">Search </w:t>
+      </w:r>
+      <w:r>
+        <w:rPr>
+          <w:rFonts w:ascii="Ubuntu Sans" w:hAnsi="Ubuntu Sans"/>
+          <w:i w:val="false"/>
+          <w:iCs w:val="false"/>
+          <w:sz w:val="20"/>
+          <w:szCs w:val="20"/>
+        </w:rPr>
+        <w:t xml:space="preserve">Recipes </w:t>
+      </w:r>
+      <w:r>
+        <w:rPr>
+          <w:rFonts w:ascii="Ubuntu Sans" w:hAnsi="Ubuntu Sans"/>
+          <w:i w:val="false"/>
+          <w:iCs w:val="false"/>
+          <w:sz w:val="20"/>
+          <w:szCs w:val="20"/>
+        </w:rPr>
+        <w:t>(RAG), Scale Recipe</w:t>
+      </w:r>
+      <w:r>
+        <w:rPr>
+          <w:rFonts w:ascii="Ubuntu Sans" w:hAnsi="Ubuntu Sans"/>
+          <w:i w:val="false"/>
+          <w:iCs w:val="false"/>
+          <w:sz w:val="20"/>
+          <w:szCs w:val="20"/>
+        </w:rPr>
+        <w:tab/>
       </w:r>
     </w:p>
     <w:p>
@@ -1177,7 +1269,17 @@
           <w:sz w:val="20"/>
           <w:szCs w:val="20"/>
         </w:rPr>
-        <w:t>September 2025 – June 2026</w:t>
+        <w:t xml:space="preserve">September 2025 – June 2026 </w:t>
+      </w:r>
+      <w:r>
+        <w:rPr>
+          <w:rFonts w:ascii="Ubuntu Sans" w:hAnsi="Ubuntu Sans"/>
+          <w:b w:val="false"/>
+          <w:bCs w:val="false"/>
+          <w:sz w:val="20"/>
+          <w:szCs w:val="20"/>
+        </w:rPr>
+        <w:t>(expected)</w:t>
       </w:r>
     </w:p>
     <w:p>

</xml_diff>

<commit_message>
Aug 21 resume update
</commit_message>
<xml_diff>
--- a/SaumiRahnamay - Resume.docx
+++ b/SaumiRahnamay - Resume.docx
@@ -306,7 +306,7 @@
           <w:sz w:val="20"/>
           <w:szCs w:val="20"/>
         </w:rPr>
-        <w:t xml:space="preserve">Machine Learning </w:t>
+        <w:t>Machine Learning</w:t>
       </w:r>
     </w:p>
     <w:p>
@@ -358,7 +358,7 @@
           <w:sz w:val="20"/>
           <w:szCs w:val="20"/>
         </w:rPr>
-        <w:t>Corpus Linguistics</w:t>
+        <w:t>NLP</w:t>
       </w:r>
     </w:p>
     <w:p>
@@ -407,18 +407,14 @@
           <w:bottom w:val="single" w:sz="6" w:space="1" w:color="000000"/>
         </w:pBdr>
         <w:spacing w:lineRule="auto" w:line="240" w:before="114" w:after="114"/>
+        <w:rPr/>
+      </w:pPr>
+      <w:r>
         <w:rPr>
           <w:rFonts w:ascii="Ubuntu Sans" w:hAnsi="Ubuntu Sans"/>
           <w:sz w:val="22"/>
           <w:szCs w:val="26"/>
         </w:rPr>
-      </w:pPr>
-      <w:r>
-        <w:rPr>
-          <w:rFonts w:ascii="Ubuntu Sans" w:hAnsi="Ubuntu Sans"/>
-          <w:sz w:val="22"/>
-          <w:szCs w:val="26"/>
-        </w:rPr>
         <w:t>Experience</w:t>
       </w:r>
     </w:p>
@@ -431,7 +427,6 @@
         </w:tabs>
         <w:spacing w:lineRule="auto" w:line="240" w:before="57" w:after="57"/>
         <w:rPr>
-          <w:rFonts w:ascii="Ubuntu Sans" w:hAnsi="Ubuntu Sans"/>
           <w:sz w:val="20"/>
           <w:szCs w:val="20"/>
         </w:rPr>
@@ -470,7 +465,10 @@
           <w:tab w:val="right" w:pos="9363" w:leader="none"/>
         </w:tabs>
         <w:spacing w:lineRule="auto" w:line="240" w:before="0" w:after="0"/>
-        <w:rPr/>
+        <w:rPr>
+          <w:sz w:val="20"/>
+          <w:szCs w:val="20"/>
+        </w:rPr>
       </w:pPr>
       <w:r>
         <w:rPr>
@@ -497,7 +495,10 @@
           <w:tab w:val="right" w:pos="9363" w:leader="none"/>
         </w:tabs>
         <w:spacing w:lineRule="auto" w:line="240" w:before="0" w:after="0"/>
-        <w:rPr/>
+        <w:rPr>
+          <w:sz w:val="20"/>
+          <w:szCs w:val="20"/>
+        </w:rPr>
       </w:pPr>
       <w:r>
         <w:rPr>
@@ -525,8 +526,8 @@
         </w:tabs>
         <w:spacing w:lineRule="auto" w:line="240" w:before="0" w:after="0"/>
         <w:rPr>
-          <w:b w:val="false"/>
-          <w:bCs w:val="false"/>
+          <w:sz w:val="20"/>
+          <w:szCs w:val="20"/>
         </w:rPr>
       </w:pPr>
       <w:r>
@@ -549,9 +550,8 @@
           <w:tab w:val="clear" w:pos="720"/>
           <w:tab w:val="right" w:pos="9363" w:leader="none"/>
         </w:tabs>
-        <w:spacing w:lineRule="auto" w:line="240" w:before="57" w:after="57"/>
-        <w:rPr>
-          <w:rFonts w:ascii="Ubuntu Sans" w:hAnsi="Ubuntu Sans"/>
+        <w:spacing w:lineRule="auto" w:line="240" w:before="0" w:after="0"/>
+        <w:rPr>
           <w:sz w:val="20"/>
           <w:szCs w:val="20"/>
         </w:rPr>
@@ -561,29 +561,25 @@
           <w:rFonts w:ascii="Ubuntu Sans" w:hAnsi="Ubuntu Sans"/>
           <w:b/>
           <w:bCs/>
-          <w:sz w:val="20"/>
-          <w:szCs w:val="20"/>
-        </w:rPr>
-        <w:t>Customer Service Representative</w:t>
-      </w:r>
-      <w:r>
-        <w:rPr>
-          <w:rFonts w:ascii="Ubuntu Sans" w:hAnsi="Ubuntu Sans"/>
-          <w:sz w:val="20"/>
-          <w:szCs w:val="20"/>
-        </w:rPr>
-        <w:t>,</w:t>
-      </w:r>
-      <w:r>
-        <w:rPr>
-          <w:rFonts w:ascii="Ubuntu Sans" w:hAnsi="Ubuntu Sans"/>
-          <w:b/>
-          <w:bCs/>
-          <w:sz w:val="20"/>
-          <w:szCs w:val="20"/>
-        </w:rPr>
-        <w:t xml:space="preserve"> Fraser Valley Real Estate Board</w:t>
+          <w:color w:val="202020"/>
+          <w:sz w:val="20"/>
+          <w:szCs w:val="20"/>
+          <w:shd w:fill="FFFFFF" w:val="clear"/>
+        </w:rPr>
+        <w:t>UBC MDS-CL Capstone, BC Cancer</w:t>
+      </w:r>
+      <w:r>
+        <w:rPr>
+          <w:rFonts w:ascii="Ubuntu Sans" w:hAnsi="Ubuntu Sans"/>
+          <w:b w:val="false"/>
+          <w:bCs w:val="false"/>
+          <w:color w:val="202020"/>
+          <w:sz w:val="20"/>
+          <w:szCs w:val="20"/>
+          <w:shd w:fill="FFFFFF" w:val="clear"/>
+        </w:rPr>
         <w:tab/>
+        <w:t xml:space="preserve">May 2026 </w:t>
       </w:r>
       <w:r>
         <w:rPr>
@@ -592,10 +588,12 @@
           <w:bCs w:val="false"/>
           <w:i w:val="false"/>
           <w:iCs w:val="false"/>
-          <w:sz w:val="20"/>
-          <w:szCs w:val="20"/>
-        </w:rPr>
-        <w:t>August 2024 – October 2024</w:t>
+          <w:color w:val="202020"/>
+          <w:sz w:val="20"/>
+          <w:szCs w:val="20"/>
+          <w:shd w:fill="FFFFFF" w:val="clear"/>
+        </w:rPr>
+        <w:t>– July 2026</w:t>
       </w:r>
     </w:p>
     <w:p>
@@ -612,17 +610,21 @@
         <w:spacing w:lineRule="auto" w:line="240" w:before="0" w:after="0"/>
         <w:rPr>
           <w:rFonts w:ascii="Ubuntu Sans" w:hAnsi="Ubuntu Sans"/>
-          <w:sz w:val="20"/>
-          <w:szCs w:val="20"/>
-        </w:rPr>
-      </w:pPr>
-      <w:r>
-        <w:rPr>
-          <w:rFonts w:ascii="Ubuntu Sans" w:hAnsi="Ubuntu Sans"/>
-          <w:sz w:val="20"/>
-          <w:szCs w:val="20"/>
-        </w:rPr>
-        <w:t>Supported data entry and client communication workflows.</w:t>
+          <w:color w:val="202020"/>
+          <w:sz w:val="20"/>
+          <w:szCs w:val="20"/>
+          <w:shd w:fill="FFFFFF" w:val="clear"/>
+        </w:rPr>
+      </w:pPr>
+      <w:r>
+        <w:rPr>
+          <w:rFonts w:ascii="Ubuntu Sans" w:hAnsi="Ubuntu Sans"/>
+          <w:color w:val="202020"/>
+          <w:sz w:val="20"/>
+          <w:szCs w:val="20"/>
+          <w:shd w:fill="FFFFFF" w:val="clear"/>
+        </w:rPr>
+        <w:t>Acted as de facto project manager between the 5-student team and the Dr. Nunez lab, running regular stand-ups and communication.</w:t>
       </w:r>
     </w:p>
     <w:p>
@@ -638,18 +640,21 @@
         </w:tabs>
         <w:spacing w:lineRule="auto" w:line="240" w:before="0" w:after="0"/>
         <w:rPr>
-          <w:rFonts w:ascii="Ubuntu Sans" w:hAnsi="Ubuntu Sans"/>
-          <w:sz w:val="20"/>
-          <w:szCs w:val="20"/>
-        </w:rPr>
-      </w:pPr>
-      <w:r>
-        <w:rPr>
-          <w:rFonts w:ascii="Ubuntu Sans" w:hAnsi="Ubuntu Sans"/>
-          <w:sz w:val="20"/>
-          <w:szCs w:val="20"/>
-        </w:rPr>
-        <w:t xml:space="preserve">Developed custom desktop macros to circumvent software-specific workflow restrictions, reducing processing time by ~5 minutes per document. </w:t>
+          <w:sz w:val="20"/>
+          <w:szCs w:val="20"/>
+        </w:rPr>
+      </w:pPr>
+      <w:r>
+        <w:rPr>
+          <w:rFonts w:ascii="Ubuntu Sans" w:hAnsi="Ubuntu Sans"/>
+          <w:b w:val="false"/>
+          <w:bCs w:val="false"/>
+          <w:color w:val="202020"/>
+          <w:sz w:val="20"/>
+          <w:szCs w:val="20"/>
+          <w:shd w:fill="FFFFFF" w:val="clear"/>
+        </w:rPr>
+        <w:t>End-to-end chatbot development: knowledge bases, RAG pipelines, frontend, UI/UX and an evaluation suite. Chatbot is complete and deployed on AWS, slated for use by real patients in the near future.</w:t>
       </w:r>
     </w:p>
     <w:p>
@@ -661,7 +666,6 @@
         </w:tabs>
         <w:spacing w:lineRule="auto" w:line="240" w:before="57" w:after="57"/>
         <w:rPr>
-          <w:rFonts w:ascii="Ubuntu Sans" w:hAnsi="Ubuntu Sans"/>
           <w:sz w:val="20"/>
           <w:szCs w:val="20"/>
         </w:rPr>
@@ -674,7 +678,25 @@
           <w:sz w:val="20"/>
           <w:szCs w:val="20"/>
         </w:rPr>
-        <w:t xml:space="preserve">Research Assistant, Simon Fraser University </w:t>
+        <w:t>Customer Service Representative</w:t>
+      </w:r>
+      <w:r>
+        <w:rPr>
+          <w:rFonts w:ascii="Ubuntu Sans" w:hAnsi="Ubuntu Sans"/>
+          <w:sz w:val="20"/>
+          <w:szCs w:val="20"/>
+        </w:rPr>
+        <w:t>,</w:t>
+      </w:r>
+      <w:r>
+        <w:rPr>
+          <w:rFonts w:ascii="Ubuntu Sans" w:hAnsi="Ubuntu Sans"/>
+          <w:b/>
+          <w:bCs/>
+          <w:sz w:val="20"/>
+          <w:szCs w:val="20"/>
+        </w:rPr>
+        <w:t xml:space="preserve"> Fraser Valley Real Estate Board</w:t>
         <w:tab/>
       </w:r>
       <w:r>
@@ -682,10 +704,12 @@
           <w:rFonts w:ascii="Ubuntu Sans" w:hAnsi="Ubuntu Sans"/>
           <w:b w:val="false"/>
           <w:bCs w:val="false"/>
-          <w:sz w:val="20"/>
-          <w:szCs w:val="20"/>
-        </w:rPr>
-        <w:t>November 2022 – May 2024</w:t>
+          <w:i w:val="false"/>
+          <w:iCs w:val="false"/>
+          <w:sz w:val="20"/>
+          <w:szCs w:val="20"/>
+        </w:rPr>
+        <w:t>August 2024 – October 2024</w:t>
       </w:r>
     </w:p>
     <w:p>
@@ -695,22 +719,20 @@
           <w:ilvl w:val="0"/>
           <w:numId w:val="8"/>
         </w:numPr>
-        <w:spacing w:lineRule="auto" w:line="240" w:before="0" w:after="0"/>
-        <w:rPr>
-          <w:rFonts w:ascii="Ubuntu Sans" w:hAnsi="Ubuntu Sans"/>
-          <w:sz w:val="20"/>
-          <w:szCs w:val="20"/>
-        </w:rPr>
-      </w:pPr>
-      <w:r>
-        <w:rPr>
-          <w:rFonts w:ascii="Ubuntu Sans" w:hAnsi="Ubuntu Sans"/>
-          <w:i w:val="false"/>
-          <w:iCs w:val="false"/>
-          <w:sz w:val="20"/>
-          <w:szCs w:val="20"/>
-        </w:rPr>
-        <w:t>Supported academic research via digitization, organization, and analysis of historic economic data.</w:t>
+        <w:tabs>
+          <w:tab w:val="clear" w:pos="720"/>
+          <w:tab w:val="right" w:pos="9363" w:leader="none"/>
+        </w:tabs>
+        <w:spacing w:lineRule="auto" w:line="240" w:before="57" w:after="57"/>
+        <w:rPr/>
+      </w:pPr>
+      <w:r>
+        <w:rPr>
+          <w:rFonts w:ascii="Ubuntu Sans" w:hAnsi="Ubuntu Sans"/>
+          <w:sz w:val="20"/>
+          <w:szCs w:val="20"/>
+        </w:rPr>
+        <w:t>Supported data entry and client communication workflows.</w:t>
       </w:r>
     </w:p>
     <w:p>
@@ -720,9 +742,66 @@
           <w:ilvl w:val="0"/>
           <w:numId w:val="8"/>
         </w:numPr>
+        <w:tabs>
+          <w:tab w:val="clear" w:pos="720"/>
+          <w:tab w:val="right" w:pos="9363" w:leader="none"/>
+        </w:tabs>
+        <w:spacing w:lineRule="auto" w:line="240" w:before="57" w:after="57"/>
+        <w:rPr/>
+      </w:pPr>
+      <w:r>
+        <w:rPr>
+          <w:rFonts w:ascii="Ubuntu Sans" w:hAnsi="Ubuntu Sans"/>
+          <w:sz w:val="20"/>
+          <w:szCs w:val="20"/>
+        </w:rPr>
+        <w:t xml:space="preserve">Developed custom desktop macros to circumvent software-specific workflow restrictions, reducing processing time by ~5 minutes per document. </w:t>
+      </w:r>
+    </w:p>
+    <w:p>
+      <w:pPr>
+        <w:pStyle w:val="Normal"/>
+        <w:tabs>
+          <w:tab w:val="clear" w:pos="720"/>
+          <w:tab w:val="right" w:pos="9363" w:leader="none"/>
+        </w:tabs>
+        <w:spacing w:lineRule="auto" w:line="240" w:before="57" w:after="57"/>
+        <w:rPr>
+          <w:sz w:val="20"/>
+          <w:szCs w:val="20"/>
+        </w:rPr>
+      </w:pPr>
+      <w:r>
+        <w:rPr>
+          <w:rFonts w:ascii="Ubuntu Sans" w:hAnsi="Ubuntu Sans"/>
+          <w:b/>
+          <w:bCs/>
+          <w:sz w:val="20"/>
+          <w:szCs w:val="20"/>
+        </w:rPr>
+        <w:t xml:space="preserve">Research Assistant, Simon Fraser University </w:t>
+        <w:tab/>
+      </w:r>
+      <w:r>
+        <w:rPr>
+          <w:rFonts w:ascii="Ubuntu Sans" w:hAnsi="Ubuntu Sans"/>
+          <w:b w:val="false"/>
+          <w:bCs w:val="false"/>
+          <w:sz w:val="20"/>
+          <w:szCs w:val="20"/>
+        </w:rPr>
+        <w:t>November 2022 – May 2024</w:t>
+      </w:r>
+    </w:p>
+    <w:p>
+      <w:pPr>
+        <w:pStyle w:val="Normal"/>
+        <w:numPr>
+          <w:ilvl w:val="0"/>
+          <w:numId w:val="7"/>
+        </w:numPr>
         <w:spacing w:lineRule="auto" w:line="240" w:before="0" w:after="0"/>
         <w:rPr>
-          <w:rFonts w:ascii="Ubuntu Sans" w:hAnsi="Ubuntu Sans"/>
           <w:sz w:val="20"/>
           <w:szCs w:val="20"/>
         </w:rPr>
@@ -735,7 +814,7 @@
           <w:sz w:val="20"/>
           <w:szCs w:val="20"/>
         </w:rPr>
-        <w:t xml:space="preserve">150+ pages of data digitized, analyzed and visualized. </w:t>
+        <w:t>Supported academic research via digitization, organization, and analysis of historic economic data.</w:t>
       </w:r>
     </w:p>
     <w:p>
@@ -743,11 +822,10 @@
         <w:pStyle w:val="Normal"/>
         <w:numPr>
           <w:ilvl w:val="0"/>
-          <w:numId w:val="8"/>
+          <w:numId w:val="7"/>
         </w:numPr>
         <w:spacing w:lineRule="auto" w:line="240" w:before="0" w:after="0"/>
         <w:rPr>
-          <w:rFonts w:ascii="Ubuntu Sans" w:hAnsi="Ubuntu Sans"/>
           <w:sz w:val="20"/>
           <w:szCs w:val="20"/>
         </w:rPr>
@@ -760,29 +838,31 @@
           <w:sz w:val="20"/>
           <w:szCs w:val="20"/>
         </w:rPr>
+        <w:t xml:space="preserve">150+ pages of data digitized, analyzed and visualized. </w:t>
+      </w:r>
+    </w:p>
+    <w:p>
+      <w:pPr>
+        <w:pStyle w:val="Normal"/>
+        <w:numPr>
+          <w:ilvl w:val="0"/>
+          <w:numId w:val="7"/>
+        </w:numPr>
+        <w:spacing w:lineRule="auto" w:line="240" w:before="0" w:after="0"/>
+        <w:rPr>
+          <w:sz w:val="20"/>
+          <w:szCs w:val="20"/>
+        </w:rPr>
+      </w:pPr>
+      <w:r>
+        <w:rPr>
+          <w:rFonts w:ascii="Ubuntu Sans" w:hAnsi="Ubuntu Sans"/>
+          <w:i w:val="false"/>
+          <w:iCs w:val="false"/>
+          <w:sz w:val="20"/>
+          <w:szCs w:val="20"/>
+        </w:rPr>
         <w:t>Data wrangling, EDA and visualization performed in R; OCR-scanning performed in Python.</w:t>
-      </w:r>
-    </w:p>
-    <w:p>
-      <w:pPr>
-        <w:pStyle w:val="Normal"/>
-        <w:tabs>
-          <w:tab w:val="clear" w:pos="720"/>
-          <w:tab w:val="right" w:pos="9363" w:leader="none"/>
-        </w:tabs>
-        <w:spacing w:lineRule="auto" w:line="240" w:before="57" w:after="57"/>
-        <w:rPr>
-          <w:rFonts w:ascii="Ubuntu Sans" w:hAnsi="Ubuntu Sans"/>
-          <w:sz w:val="20"/>
-          <w:szCs w:val="20"/>
-        </w:rPr>
-      </w:pPr>
-      <w:r>
-        <w:rPr>
-          <w:rFonts w:ascii="Ubuntu Sans" w:hAnsi="Ubuntu Sans"/>
-          <w:sz w:val="20"/>
-          <w:szCs w:val="20"/>
-        </w:rPr>
       </w:r>
     </w:p>
     <w:p>
@@ -792,11 +872,7 @@
           <w:bottom w:val="single" w:sz="6" w:space="1" w:color="000000"/>
         </w:pBdr>
         <w:spacing w:lineRule="auto" w:line="240" w:before="120" w:after="0"/>
-        <w:rPr>
-          <w:rFonts w:ascii="Ubuntu Sans" w:hAnsi="Ubuntu Sans"/>
-          <w:sz w:val="22"/>
-          <w:szCs w:val="26"/>
-        </w:rPr>
+        <w:rPr/>
       </w:pPr>
       <w:r>
         <w:rPr>
@@ -856,7 +932,6 @@
         </w:tabs>
         <w:spacing w:lineRule="auto" w:line="240" w:before="0" w:after="0"/>
         <w:rPr>
-          <w:rFonts w:ascii="Ubuntu Sans" w:hAnsi="Ubuntu Sans"/>
           <w:sz w:val="20"/>
           <w:szCs w:val="20"/>
         </w:rPr>
@@ -869,7 +944,7 @@
           <w:sz w:val="20"/>
           <w:szCs w:val="20"/>
         </w:rPr>
-        <w:t>A Byte-Pair Encoding Tokenizer coded from scratch with no AI assistance. Tokenization is the first step of any machine learning application involving natural language (e.g. LLMs).</w:t>
+        <w:t>A Byte-Pair Encoding Tokenizer coded from scratch (with no AI assistance). Tokenization is the first step of any machine learning application involving natural language (e.g. LLMs).</w:t>
       </w:r>
     </w:p>
     <w:p>
@@ -885,7 +960,6 @@
         </w:tabs>
         <w:spacing w:lineRule="auto" w:line="240" w:before="0" w:after="0"/>
         <w:rPr>
-          <w:rFonts w:ascii="Ubuntu Sans" w:hAnsi="Ubuntu Sans"/>
           <w:sz w:val="20"/>
           <w:szCs w:val="20"/>
         </w:rPr>
@@ -899,99 +973,6 @@
           <w:szCs w:val="20"/>
         </w:rPr>
         <w:t>Packages: NumPy</w:t>
-      </w:r>
-    </w:p>
-    <w:p>
-      <w:pPr>
-        <w:pStyle w:val="Normal"/>
-        <w:tabs>
-          <w:tab w:val="clear" w:pos="720"/>
-          <w:tab w:val="right" w:pos="9360" w:leader="none"/>
-        </w:tabs>
-        <w:spacing w:lineRule="auto" w:line="240" w:before="57" w:after="57"/>
-        <w:rPr/>
-      </w:pPr>
-      <w:r>
-        <w:rPr>
-          <w:rFonts w:ascii="Ubuntu Sans" w:hAnsi="Ubuntu Sans"/>
-          <w:b/>
-          <w:bCs/>
-          <w:sz w:val="20"/>
-          <w:szCs w:val="20"/>
-        </w:rPr>
-        <w:t>Optimizing Gratuity</w:t>
-        <w:tab/>
-      </w:r>
-      <w:hyperlink r:id="rId9">
-        <w:r>
-          <w:rPr>
-            <w:rStyle w:val="Hyperlink"/>
-            <w:rFonts w:ascii="Ubuntu Sans" w:hAnsi="Ubuntu Sans"/>
-            <w:b w:val="false"/>
-            <w:bCs w:val="false"/>
-            <w:sz w:val="20"/>
-            <w:szCs w:val="20"/>
-          </w:rPr>
-          <w:t>Available on Website</w:t>
-        </w:r>
-      </w:hyperlink>
-    </w:p>
-    <w:p>
-      <w:pPr>
-        <w:pStyle w:val="Normal"/>
-        <w:numPr>
-          <w:ilvl w:val="0"/>
-          <w:numId w:val="4"/>
-        </w:numPr>
-        <w:tabs>
-          <w:tab w:val="clear" w:pos="720"/>
-          <w:tab w:val="right" w:pos="9360" w:leader="none"/>
-        </w:tabs>
-        <w:spacing w:lineRule="auto" w:line="240" w:before="0" w:after="0"/>
-        <w:rPr>
-          <w:rFonts w:ascii="Ubuntu Sans" w:hAnsi="Ubuntu Sans"/>
-          <w:sz w:val="20"/>
-          <w:szCs w:val="20"/>
-        </w:rPr>
-      </w:pPr>
-      <w:r>
-        <w:rPr>
-          <w:rFonts w:ascii="Ubuntu Sans" w:hAnsi="Ubuntu Sans"/>
-          <w:i w:val="false"/>
-          <w:iCs w:val="false"/>
-          <w:sz w:val="20"/>
-          <w:szCs w:val="20"/>
-        </w:rPr>
-        <w:t>When, and under which conditions do I get the best tips at my pizza delivery job? Modeling trends in customer tip behavior to infer when I should schedule myself to maximize my tips.</w:t>
-      </w:r>
-    </w:p>
-    <w:p>
-      <w:pPr>
-        <w:pStyle w:val="Normal"/>
-        <w:numPr>
-          <w:ilvl w:val="0"/>
-          <w:numId w:val="4"/>
-        </w:numPr>
-        <w:tabs>
-          <w:tab w:val="clear" w:pos="720"/>
-          <w:tab w:val="right" w:pos="9360" w:leader="none"/>
-        </w:tabs>
-        <w:spacing w:lineRule="auto" w:line="240" w:before="0" w:after="0"/>
-        <w:rPr>
-          <w:rFonts w:ascii="Ubuntu Sans" w:hAnsi="Ubuntu Sans"/>
-          <w:sz w:val="20"/>
-          <w:szCs w:val="20"/>
-        </w:rPr>
-      </w:pPr>
-      <w:r>
-        <w:rPr>
-          <w:rFonts w:ascii="Ubuntu Sans" w:hAnsi="Ubuntu Sans"/>
-          <w:i w:val="false"/>
-          <w:iCs w:val="false"/>
-          <w:sz w:val="20"/>
-          <w:szCs w:val="20"/>
-        </w:rPr>
-        <w:t xml:space="preserve">Demonstrated a 106.16% increase in expected tips; demonstrated the effect of preset tip percentage options on expected tip. Inferential statistics performed with R.  </w:t>
         <w:tab/>
         <w:tab/>
       </w:r>
@@ -1026,7 +1007,7 @@
         </w:rPr>
         <w:tab/>
       </w:r>
-      <w:hyperlink r:id="rId10">
+      <w:hyperlink r:id="rId9">
         <w:r>
           <w:rPr>
             <w:rStyle w:val="Hyperlink"/>
@@ -1043,14 +1024,17 @@
         <w:pStyle w:val="Normal"/>
         <w:numPr>
           <w:ilvl w:val="0"/>
-          <w:numId w:val="5"/>
+          <w:numId w:val="4"/>
         </w:numPr>
         <w:tabs>
           <w:tab w:val="clear" w:pos="720"/>
           <w:tab w:val="right" w:pos="9360" w:leader="none"/>
         </w:tabs>
         <w:spacing w:lineRule="auto" w:line="240" w:before="0" w:after="0"/>
-        <w:rPr/>
+        <w:rPr>
+          <w:sz w:val="20"/>
+          <w:szCs w:val="20"/>
+        </w:rPr>
       </w:pPr>
       <w:r>
         <w:rPr>
@@ -1060,7 +1044,101 @@
           <w:sz w:val="20"/>
           <w:szCs w:val="20"/>
         </w:rPr>
-        <w:t>Simple kitchen assistant agent prototype made from scratch. A friendly agent that provides information about cookbook recipes; ability to scale recipes based on user intent.</w:t>
+        <w:t>Simple kitchen assistant agent prototype made from scratch (with AI assistance). A friendly agent that provides information about cookbook recipes; ability to scale recipes based on user intent.</w:t>
+      </w:r>
+    </w:p>
+    <w:p>
+      <w:pPr>
+        <w:pStyle w:val="Normal"/>
+        <w:numPr>
+          <w:ilvl w:val="0"/>
+          <w:numId w:val="4"/>
+        </w:numPr>
+        <w:tabs>
+          <w:tab w:val="clear" w:pos="720"/>
+          <w:tab w:val="right" w:pos="9360" w:leader="none"/>
+        </w:tabs>
+        <w:spacing w:lineRule="auto" w:line="240" w:before="0" w:after="0"/>
+        <w:rPr/>
+      </w:pPr>
+      <w:r>
+        <w:rPr>
+          <w:rFonts w:ascii="Ubuntu Sans" w:hAnsi="Ubuntu Sans"/>
+          <w:i w:val="false"/>
+          <w:iCs w:val="false"/>
+          <w:sz w:val="20"/>
+          <w:szCs w:val="20"/>
+        </w:rPr>
+        <w:t>Tool calls: Search Recipes (RAG), Scale Recipe</w:t>
+        <w:tab/>
+      </w:r>
+    </w:p>
+    <w:p>
+      <w:pPr>
+        <w:pStyle w:val="Normal"/>
+        <w:pBdr>
+          <w:bottom w:val="single" w:sz="6" w:space="1" w:color="000000"/>
+        </w:pBdr>
+        <w:spacing w:lineRule="auto" w:line="240" w:before="120" w:after="0"/>
+        <w:rPr/>
+      </w:pPr>
+      <w:r>
+        <w:rPr>
+          <w:rFonts w:ascii="Ubuntu Sans" w:hAnsi="Ubuntu Sans"/>
+          <w:sz w:val="22"/>
+          <w:szCs w:val="26"/>
+        </w:rPr>
+        <w:t>Education</w:t>
+      </w:r>
+    </w:p>
+    <w:p>
+      <w:pPr>
+        <w:pStyle w:val="Normal"/>
+        <w:tabs>
+          <w:tab w:val="clear" w:pos="720"/>
+          <w:tab w:val="right" w:pos="9363" w:leader="none"/>
+        </w:tabs>
+        <w:spacing w:lineRule="auto" w:line="240" w:before="57" w:after="57"/>
+        <w:jc w:val="left"/>
+        <w:rPr/>
+      </w:pPr>
+      <w:r>
+        <w:rPr>
+          <w:rFonts w:ascii="Ubuntu Sans" w:hAnsi="Ubuntu Sans"/>
+          <w:b/>
+          <w:bCs/>
+          <w:sz w:val="20"/>
+          <w:szCs w:val="20"/>
+        </w:rPr>
+        <w:t>University of British Columbia (UBC)</w:t>
+      </w:r>
+      <w:r>
+        <w:rPr>
+          <w:rFonts w:ascii="Ubuntu Sans" w:hAnsi="Ubuntu Sans"/>
+          <w:sz w:val="20"/>
+          <w:szCs w:val="20"/>
+        </w:rPr>
+        <w:t xml:space="preserve"> </w:t>
+      </w:r>
+      <w:r>
+        <w:rPr>
+          <w:rFonts w:ascii="Ubuntu Sans" w:hAnsi="Ubuntu Sans"/>
+          <w:b/>
+          <w:bCs/>
+          <w:sz w:val="20"/>
+          <w:szCs w:val="20"/>
+        </w:rPr>
+        <w:tab/>
+      </w:r>
+      <w:r>
+        <w:rPr>
+          <w:rFonts w:ascii="Ubuntu Sans" w:hAnsi="Ubuntu Sans"/>
+          <w:b w:val="false"/>
+          <w:bCs w:val="false"/>
+          <w:sz w:val="20"/>
+          <w:szCs w:val="20"/>
+        </w:rPr>
+        <w:t>September 2025 – June 2026</w:t>
       </w:r>
     </w:p>
     <w:p>
@@ -1070,10 +1148,6 @@
           <w:ilvl w:val="0"/>
           <w:numId w:val="5"/>
         </w:numPr>
-        <w:tabs>
-          <w:tab w:val="clear" w:pos="720"/>
-          <w:tab w:val="right" w:pos="9360" w:leader="none"/>
-        </w:tabs>
         <w:spacing w:lineRule="auto" w:line="240" w:before="0" w:after="0"/>
         <w:rPr/>
       </w:pPr>
@@ -1085,30 +1159,7 @@
           <w:sz w:val="20"/>
           <w:szCs w:val="20"/>
         </w:rPr>
-        <w:t>Tool calls: Search Recipes (RAG), Scale Recipe</w:t>
-        <w:tab/>
-      </w:r>
-    </w:p>
-    <w:p>
-      <w:pPr>
-        <w:pStyle w:val="Normal"/>
-        <w:pBdr>
-          <w:bottom w:val="single" w:sz="6" w:space="1" w:color="000000"/>
-        </w:pBdr>
-        <w:spacing w:lineRule="auto" w:line="240" w:before="120" w:after="0"/>
-        <w:rPr>
-          <w:rFonts w:ascii="Ubuntu Sans" w:hAnsi="Ubuntu Sans"/>
-          <w:sz w:val="22"/>
-          <w:szCs w:val="26"/>
-        </w:rPr>
-      </w:pPr>
-      <w:r>
-        <w:rPr>
-          <w:rFonts w:ascii="Ubuntu Sans" w:hAnsi="Ubuntu Sans"/>
-          <w:sz w:val="22"/>
-          <w:szCs w:val="26"/>
-        </w:rPr>
-        <w:t>Education</w:t>
+        <w:t>Master of Data Science, Computational Linguistics</w:t>
       </w:r>
     </w:p>
     <w:p>
@@ -1119,90 +1170,7 @@
           <w:tab w:val="right" w:pos="9363" w:leader="none"/>
         </w:tabs>
         <w:spacing w:lineRule="auto" w:line="240" w:before="57" w:after="57"/>
-        <w:jc w:val="left"/>
-        <w:rPr>
-          <w:rFonts w:ascii="Ubuntu Sans" w:hAnsi="Ubuntu Sans"/>
-          <w:sz w:val="20"/>
-          <w:szCs w:val="20"/>
-        </w:rPr>
-      </w:pPr>
-      <w:r>
-        <w:rPr>
-          <w:rFonts w:ascii="Ubuntu Sans" w:hAnsi="Ubuntu Sans"/>
-          <w:b/>
-          <w:bCs/>
-          <w:sz w:val="20"/>
-          <w:szCs w:val="20"/>
-        </w:rPr>
-        <w:t>University of British Columbia (UBC)</w:t>
-      </w:r>
-      <w:r>
-        <w:rPr>
-          <w:rFonts w:ascii="Ubuntu Sans" w:hAnsi="Ubuntu Sans"/>
-          <w:sz w:val="20"/>
-          <w:szCs w:val="20"/>
-        </w:rPr>
-        <w:t xml:space="preserve"> </w:t>
-      </w:r>
-      <w:r>
-        <w:rPr>
-          <w:rFonts w:ascii="Ubuntu Sans" w:hAnsi="Ubuntu Sans"/>
-          <w:b/>
-          <w:bCs/>
-          <w:sz w:val="20"/>
-          <w:szCs w:val="20"/>
-        </w:rPr>
-        <w:tab/>
-      </w:r>
-      <w:r>
-        <w:rPr>
-          <w:rFonts w:ascii="Ubuntu Sans" w:hAnsi="Ubuntu Sans"/>
-          <w:b w:val="false"/>
-          <w:bCs w:val="false"/>
-          <w:sz w:val="20"/>
-          <w:szCs w:val="20"/>
-        </w:rPr>
-        <w:t>September 2025 – June 2026</w:t>
-      </w:r>
-    </w:p>
-    <w:p>
-      <w:pPr>
-        <w:pStyle w:val="Normal"/>
-        <w:numPr>
-          <w:ilvl w:val="0"/>
-          <w:numId w:val="6"/>
-        </w:numPr>
-        <w:spacing w:lineRule="auto" w:line="240" w:before="0" w:after="0"/>
-        <w:rPr>
-          <w:rFonts w:ascii="Ubuntu Sans" w:hAnsi="Ubuntu Sans"/>
-          <w:sz w:val="20"/>
-          <w:szCs w:val="20"/>
-        </w:rPr>
-      </w:pPr>
-      <w:r>
-        <w:rPr>
-          <w:rFonts w:ascii="Ubuntu Sans" w:hAnsi="Ubuntu Sans"/>
-          <w:i w:val="false"/>
-          <w:iCs w:val="false"/>
-          <w:sz w:val="20"/>
-          <w:szCs w:val="20"/>
-        </w:rPr>
-        <w:t>Master of Data Science, Computational Linguistics</w:t>
-      </w:r>
-    </w:p>
-    <w:p>
-      <w:pPr>
-        <w:pStyle w:val="Normal"/>
-        <w:tabs>
-          <w:tab w:val="clear" w:pos="720"/>
-          <w:tab w:val="right" w:pos="9363" w:leader="none"/>
-        </w:tabs>
-        <w:spacing w:lineRule="auto" w:line="240" w:before="57" w:after="57"/>
-        <w:rPr>
-          <w:rFonts w:ascii="Ubuntu Sans" w:hAnsi="Ubuntu Sans"/>
-          <w:sz w:val="20"/>
-          <w:szCs w:val="20"/>
-        </w:rPr>
+        <w:rPr/>
       </w:pPr>
       <w:r>
         <w:rPr>
@@ -1238,11 +1206,7 @@
           <w:tab w:val="right" w:pos="9363" w:leader="none"/>
         </w:tabs>
         <w:spacing w:lineRule="auto" w:line="240" w:before="57" w:after="57"/>
-        <w:rPr>
-          <w:rFonts w:ascii="Ubuntu Sans" w:hAnsi="Ubuntu Sans"/>
-          <w:sz w:val="20"/>
-          <w:szCs w:val="20"/>
-        </w:rPr>
+        <w:rPr/>
       </w:pPr>
       <w:r>
         <w:rPr>
@@ -1271,7 +1235,7 @@
         <w:pStyle w:val="Normal"/>
         <w:numPr>
           <w:ilvl w:val="0"/>
-          <w:numId w:val="7"/>
+          <w:numId w:val="6"/>
         </w:numPr>
         <w:spacing w:lineRule="auto" w:line="240" w:before="0" w:after="0"/>
         <w:rPr>
@@ -3126,6 +3090,11 @@
       <w:rFonts w:ascii="OpenSymbol" w:hAnsi="OpenSymbol" w:eastAsia="OpenSymbol" w:cs="OpenSymbol"/>
     </w:rPr>
   </w:style>
+  <w:style w:type="character" w:styleId="NumberingSymbols">
+    <w:name w:val="Numbering Symbols"/>
+    <w:qFormat/>
+    <w:rPr/>
+  </w:style>
   <w:style w:type="paragraph" w:styleId="Heading">
     <w:name w:val="Heading"/>
     <w:basedOn w:val="Normal"/>
@@ -3258,11 +3227,37 @@
     </w:pPr>
     <w:rPr/>
   </w:style>
+  <w:style w:type="paragraph" w:styleId="ListContinue">
+    <w:name w:val="List Continue"/>
+    <w:basedOn w:val="List"/>
+    <w:pPr>
+      <w:spacing w:before="0" w:after="120"/>
+      <w:ind w:hanging="0" w:left="360"/>
+    </w:pPr>
+    <w:rPr/>
+  </w:style>
+  <w:style w:type="paragraph" w:styleId="ListBullet">
+    <w:name w:val="List Bullet"/>
+    <w:basedOn w:val="List"/>
+    <w:pPr>
+      <w:spacing w:before="0" w:after="120"/>
+      <w:ind w:hanging="360" w:left="360"/>
+    </w:pPr>
+    <w:rPr/>
+  </w:style>
   <w:style w:type="numbering" w:styleId="NoList" w:default="1">
     <w:name w:val="No List"/>
     <w:uiPriority w:val="99"/>
     <w:semiHidden/>
     <w:unhideWhenUsed/>
+    <w:qFormat/>
+  </w:style>
+  <w:style w:type="numbering" w:styleId="Bullet">
+    <w:name w:val="Bullet •"/>
+    <w:qFormat/>
+  </w:style>
+  <w:style w:type="numbering" w:styleId="Numbering123">
+    <w:name w:val="Numbering 123"/>
     <w:qFormat/>
   </w:style>
   <w:style w:type="table" w:default="1" w:styleId="TableNormal">

</xml_diff>